<commit_message>
v0.06: Deploy to Vercel + IS24 parser overhaul
Vercel Deployment:
- Webapp live at https://webapp-alpha-wheat.vercel.app
- CORS headers for Extension → Vercel API communication
- Leads store: in-memory with filesystem fallback (Vercel compatible)
- next.config: removed standalone output, added API CORS headers

Extension → Vercel:
- Popup sends leads to Vercel URL instead of localhost
- Added Vercel domain to manifest host_permissions

IS24 Parser overhaul:
- 4 detection methods: JSON-LD, DOM selectors, body regex, meta tags
- JSON-LD structured data parsing (schema.org, most reliable)
- 8 different price regex patterns as fallback
- Meta tag fallback for title extraction

Co-Authored-By: Claude Opus 4.6 (1M context) <noreply@anthropic.com>
</commit_message>
<xml_diff>
--- a/Docs/StandVersion.docx
+++ b/Docs/StandVersion.docx
@@ -156,10 +156,78 @@
     </w:p>
     <w:p>
       <w:pPr>
-        <w:rPr>
-          <w:lang w:val="de-DE"/>
-        </w:rPr>
-      </w:pPr>
+        <w:pStyle w:val="berschrift1"/>
+        <w:rPr>
+          <w:lang w:val="de-DE"/>
+        </w:rPr>
+      </w:pPr>
+      <w:r>
+        <w:rPr>
+          <w:lang w:val="de-DE"/>
+        </w:rPr>
+        <w:t>Version 0.05</w:t>
+      </w:r>
+    </w:p>
+    <w:p>
+      <w:pPr>
+        <w:rPr>
+          <w:lang w:val="de-DE"/>
+        </w:rPr>
+      </w:pPr>
+      <w:proofErr w:type="spellStart"/>
+      <w:r>
+        <w:rPr>
+          <w:lang w:val="de-DE"/>
+        </w:rPr>
+        <w:t>Plugin</w:t>
+      </w:r>
+      <w:proofErr w:type="spellEnd"/>
+      <w:r>
+        <w:rPr>
+          <w:lang w:val="de-DE"/>
+        </w:rPr>
+        <w:t xml:space="preserve"> soll mit </w:t>
+      </w:r>
+      <w:proofErr w:type="spellStart"/>
+      <w:r>
+        <w:rPr>
+          <w:lang w:val="de-DE"/>
+        </w:rPr>
+        <w:t>tool</w:t>
+      </w:r>
+      <w:proofErr w:type="spellEnd"/>
+      <w:r>
+        <w:rPr>
+          <w:lang w:val="de-DE"/>
+        </w:rPr>
+        <w:t xml:space="preserve"> kommunizieren</w:t>
+      </w:r>
+    </w:p>
+    <w:p>
+      <w:pPr>
+        <w:rPr>
+          <w:lang w:val="de-DE"/>
+        </w:rPr>
+      </w:pPr>
+      <w:r>
+        <w:rPr>
+          <w:lang w:val="de-DE"/>
+        </w:rPr>
+        <w:t>Standortscore erweitert</w:t>
+      </w:r>
+    </w:p>
+    <w:p>
+      <w:pPr>
+        <w:rPr>
+          <w:lang w:val="de-DE"/>
+        </w:rPr>
+      </w:pPr>
+      <w:r>
+        <w:rPr>
+          <w:lang w:val="de-DE"/>
+        </w:rPr>
+        <w:t>n</w:t>
+      </w:r>
       <w:bookmarkStart w:id="0" w:name="_GoBack"/>
       <w:bookmarkEnd w:id="0"/>
     </w:p>

</xml_diff>

<commit_message>
Test auto-deploy: gitignore temp files
Co-Authored-By: Claude Opus 4.6 (1M context) <noreply@anthropic.com>
</commit_message>
<xml_diff>
--- a/Docs/StandVersion.docx
+++ b/Docs/StandVersion.docx
@@ -226,8 +226,91 @@
         <w:rPr>
           <w:lang w:val="de-DE"/>
         </w:rPr>
-        <w:t>n</w:t>
-      </w:r>
+        <w:t>Fehler beim Schicken ans Makler Toolkit</w:t>
+      </w:r>
+    </w:p>
+    <w:p>
+      <w:pPr>
+        <w:rPr>
+          <w:lang w:val="de-DE"/>
+        </w:rPr>
+      </w:pPr>
+      <w:proofErr w:type="spellStart"/>
+      <w:r>
+        <w:rPr>
+          <w:lang w:val="de-DE"/>
+        </w:rPr>
+        <w:t>Immoscout</w:t>
+      </w:r>
+      <w:proofErr w:type="spellEnd"/>
+      <w:r>
+        <w:rPr>
+          <w:lang w:val="de-DE"/>
+        </w:rPr>
+        <w:t xml:space="preserve"> kann auch noch nicht schicken</w:t>
+      </w:r>
+    </w:p>
+    <w:p>
+      <w:pPr>
+        <w:pStyle w:val="berschrift1"/>
+        <w:rPr>
+          <w:lang w:val="de-DE"/>
+        </w:rPr>
+      </w:pPr>
+      <w:r>
+        <w:rPr>
+          <w:lang w:val="de-DE"/>
+        </w:rPr>
+        <w:t>Version 0.06</w:t>
+      </w:r>
+    </w:p>
+    <w:p>
+      <w:pPr>
+        <w:rPr>
+          <w:lang w:val="de-DE"/>
+        </w:rPr>
+      </w:pPr>
+      <w:r>
+        <w:rPr>
+          <w:lang w:val="de-DE"/>
+        </w:rPr>
+        <w:t xml:space="preserve">Webtool ist jetzt auf </w:t>
+      </w:r>
+      <w:proofErr w:type="spellStart"/>
+      <w:r>
+        <w:rPr>
+          <w:lang w:val="de-DE"/>
+        </w:rPr>
+        <w:t>Vercel</w:t>
+      </w:r>
+      <w:proofErr w:type="spellEnd"/>
+      <w:r>
+        <w:rPr>
+          <w:lang w:val="de-DE"/>
+        </w:rPr>
+        <w:t xml:space="preserve"> geladen, damit alles über einen </w:t>
+      </w:r>
+      <w:proofErr w:type="spellStart"/>
+      <w:r>
+        <w:rPr>
+          <w:lang w:val="de-DE"/>
+        </w:rPr>
+        <w:t>server</w:t>
+      </w:r>
+      <w:proofErr w:type="spellEnd"/>
+      <w:r>
+        <w:rPr>
+          <w:lang w:val="de-DE"/>
+        </w:rPr>
+        <w:t xml:space="preserve"> läuft</w:t>
+      </w:r>
+    </w:p>
+    <w:p>
+      <w:pPr>
+        <w:rPr>
+          <w:lang w:val="de-DE"/>
+        </w:rPr>
+      </w:pPr>
       <w:bookmarkStart w:id="0" w:name="_GoBack"/>
       <w:bookmarkEnd w:id="0"/>
     </w:p>

</xml_diff>

<commit_message>
v0.10: Fix session cookie for HTTP (disable secure flag)
Co-Authored-By: Claude Opus 4.6 (1M context) <noreply@anthropic.com>
</commit_message>
<xml_diff>
--- a/Docs/StandVersion.docx
+++ b/Docs/StandVersion.docx
@@ -8,14 +8,12 @@
           <w:lang w:val="de-DE"/>
         </w:rPr>
       </w:pPr>
-      <w:proofErr w:type="spellStart"/>
       <w:r>
         <w:rPr>
           <w:lang w:val="de-DE"/>
         </w:rPr>
         <w:t>StandVersion</w:t>
       </w:r>
-      <w:proofErr w:type="spellEnd"/>
     </w:p>
     <w:p>
       <w:pPr>
@@ -55,21 +53,7 @@
           <w:lang w:val="de-DE"/>
         </w:rPr>
         <w:tab/>
-        <w:t xml:space="preserve">Scheint mit </w:t>
-      </w:r>
-      <w:proofErr w:type="spellStart"/>
-      <w:r>
-        <w:rPr>
-          <w:lang w:val="de-DE"/>
-        </w:rPr>
-        <w:t>Immoscout</w:t>
-      </w:r>
-      <w:proofErr w:type="spellEnd"/>
-      <w:r>
-        <w:rPr>
-          <w:lang w:val="de-DE"/>
-        </w:rPr>
-        <w:t xml:space="preserve"> 24 noch nicht zu funktionieren</w:t>
+        <w:t>Scheint mit Immoscout 24 noch nicht zu funktionieren</w:t>
       </w:r>
     </w:p>
     <w:p>
@@ -83,21 +67,7 @@
           <w:lang w:val="de-DE"/>
         </w:rPr>
         <w:tab/>
-        <w:t xml:space="preserve">Score kann nicht vergeben werden, da </w:t>
-      </w:r>
-      <w:proofErr w:type="spellStart"/>
-      <w:r>
-        <w:rPr>
-          <w:lang w:val="de-DE"/>
-        </w:rPr>
-        <w:t>adresse</w:t>
-      </w:r>
-      <w:proofErr w:type="spellEnd"/>
-      <w:r>
-        <w:rPr>
-          <w:lang w:val="de-DE"/>
-        </w:rPr>
-        <w:t xml:space="preserve"> nicht genau angezeigt.</w:t>
+        <w:t>Score kann nicht vergeben werden, da adresse nicht genau angezeigt.</w:t>
       </w:r>
     </w:p>
     <w:p>
@@ -137,21 +107,7 @@
         <w:rPr>
           <w:lang w:val="de-DE"/>
         </w:rPr>
-        <w:t xml:space="preserve">Eigenes Inserat machen um die </w:t>
-      </w:r>
-      <w:proofErr w:type="spellStart"/>
-      <w:r>
-        <w:rPr>
-          <w:lang w:val="de-DE"/>
-        </w:rPr>
-        <w:t>veränderungen</w:t>
-      </w:r>
-      <w:proofErr w:type="spellEnd"/>
-      <w:r>
-        <w:rPr>
-          <w:lang w:val="de-DE"/>
-        </w:rPr>
-        <w:t xml:space="preserve"> testen zu können.</w:t>
+        <w:t>Eigenes Inserat machen um die veränderungen testen zu können.</w:t>
       </w:r>
     </w:p>
     <w:p>
@@ -174,33 +130,11 @@
           <w:lang w:val="de-DE"/>
         </w:rPr>
       </w:pPr>
-      <w:proofErr w:type="spellStart"/>
-      <w:r>
-        <w:rPr>
-          <w:lang w:val="de-DE"/>
-        </w:rPr>
-        <w:t>Plugin</w:t>
-      </w:r>
-      <w:proofErr w:type="spellEnd"/>
-      <w:r>
-        <w:rPr>
-          <w:lang w:val="de-DE"/>
-        </w:rPr>
-        <w:t xml:space="preserve"> soll mit </w:t>
-      </w:r>
-      <w:proofErr w:type="spellStart"/>
-      <w:r>
-        <w:rPr>
-          <w:lang w:val="de-DE"/>
-        </w:rPr>
-        <w:t>tool</w:t>
-      </w:r>
-      <w:proofErr w:type="spellEnd"/>
-      <w:r>
-        <w:rPr>
-          <w:lang w:val="de-DE"/>
-        </w:rPr>
-        <w:t xml:space="preserve"> kommunizieren</w:t>
+      <w:r>
+        <w:rPr>
+          <w:lang w:val="de-DE"/>
+        </w:rPr>
+        <w:t>Plugin soll mit tool kommunizieren</w:t>
       </w:r>
     </w:p>
     <w:p>
@@ -235,19 +169,11 @@
           <w:lang w:val="de-DE"/>
         </w:rPr>
       </w:pPr>
-      <w:proofErr w:type="spellStart"/>
-      <w:r>
-        <w:rPr>
-          <w:lang w:val="de-DE"/>
-        </w:rPr>
-        <w:t>Immoscout</w:t>
-      </w:r>
-      <w:proofErr w:type="spellEnd"/>
-      <w:r>
-        <w:rPr>
-          <w:lang w:val="de-DE"/>
-        </w:rPr>
-        <w:t xml:space="preserve"> kann auch noch nicht schicken</w:t>
+      <w:r>
+        <w:rPr>
+          <w:lang w:val="de-DE"/>
+        </w:rPr>
+        <w:t>Immoscout kann auch noch nicht schicken</w:t>
       </w:r>
     </w:p>
     <w:p>
@@ -274,45 +200,50 @@
         <w:rPr>
           <w:lang w:val="de-DE"/>
         </w:rPr>
-        <w:t xml:space="preserve">Webtool ist jetzt auf </w:t>
-      </w:r>
-      <w:proofErr w:type="spellStart"/>
-      <w:r>
-        <w:rPr>
-          <w:lang w:val="de-DE"/>
-        </w:rPr>
-        <w:t>Vercel</w:t>
-      </w:r>
-      <w:proofErr w:type="spellEnd"/>
-      <w:r>
-        <w:rPr>
-          <w:lang w:val="de-DE"/>
-        </w:rPr>
-        <w:t xml:space="preserve"> geladen, damit alles über einen </w:t>
-      </w:r>
-      <w:proofErr w:type="spellStart"/>
-      <w:r>
-        <w:rPr>
-          <w:lang w:val="de-DE"/>
-        </w:rPr>
-        <w:t>server</w:t>
-      </w:r>
-      <w:proofErr w:type="spellEnd"/>
-      <w:r>
-        <w:rPr>
-          <w:lang w:val="de-DE"/>
-        </w:rPr>
-        <w:t xml:space="preserve"> läuft</w:t>
-      </w:r>
-    </w:p>
-    <w:p>
-      <w:pPr>
-        <w:rPr>
-          <w:lang w:val="de-DE"/>
-        </w:rPr>
-      </w:pPr>
+        <w:t>Webtool ist jetzt auf Vercel geladen, damit alles über einen server läuft</w:t>
+      </w:r>
+    </w:p>
+    <w:p>
+      <w:pPr>
+        <w:pStyle w:val="berschrift1"/>
+        <w:rPr>
+          <w:lang w:val="de-DE"/>
+        </w:rPr>
+      </w:pPr>
+      <w:r>
+        <w:rPr>
+          <w:lang w:val="de-DE"/>
+        </w:rPr>
+        <w:t>Version 0.09</w:t>
+      </w:r>
       <w:bookmarkStart w:id="0" w:name="_GoBack"/>
       <w:bookmarkEnd w:id="0"/>
+    </w:p>
+    <w:p>
+      <w:pPr>
+        <w:rPr>
+          <w:lang w:val="de-DE"/>
+        </w:rPr>
+      </w:pPr>
+      <w:r>
+        <w:rPr>
+          <w:lang w:val="de-DE"/>
+        </w:rPr>
+        <w:t>Läuft jetzt mit einer online Datenbank</w:t>
+      </w:r>
+    </w:p>
+    <w:p>
+      <w:pPr>
+        <w:rPr>
+          <w:lang w:val="de-DE"/>
+        </w:rPr>
+      </w:pPr>
+      <w:r>
+        <w:rPr>
+          <w:lang w:val="de-DE"/>
+        </w:rPr>
+        <w:t>Plugin scheint auch auf immoscout zu funktionieren und notizen sind eingefügt. Alles andere muss vom User weiter getestet werden.</w:t>
+      </w:r>
     </w:p>
     <w:sectPr>
       <w:pgSz w:w="11906" w:h="16838"/>

</xml_diff>